<commit_message>
Belge yayın ve revizyon tarihlerini ana listeyle eşleştir
</commit_message>
<xml_diff>
--- a/EKG_Kalite_Yönetim_Sistemi/00_Yönetim Sistemi Çerçevesi/01_Kapsam, Süreçler ve Görevler/EKG-YNT-EKT-01_kalite_yonetim_sistemi_el_kitabi.docx
+++ b/EKG_Kalite_Yönetim_Sistemi/00_Yönetim Sistemi Çerçevesi/01_Kapsam, Süreçler ve Görevler/EKG-YNT-EKT-01_kalite_yonetim_sistemi_el_kitabi.docx
@@ -696,6 +696,18 @@
     </w:r>
     <w:fldSimple w:instr="NUMPAGES"/>
   </w:p>
+  <w:p>
+    <w:pPr>
+      <w:spacing w:before="0" w:after="0"/>
+    </w:pPr>
+    <w:r>
+      <w:rPr>
+        <w:rFonts w:ascii="Arial" w:hAnsi="Arial"/>
+        <w:sz w:val="20"/>
+      </w:rPr>
+      <w:t>Revizyon nedeni: El kitabındaki çelişkiler ve tekrarlar giderildi; kapsam ve süreç arayüzleri sadeleştirildi.</w:t>
+    </w:r>
+  </w:p>
 </w:ftr>
 </file>
 
@@ -814,7 +826,7 @@
               <w:sz w:val="17"/>
             </w:rPr>
             <w:br/>
-            <w:t>Revizyon tarihi: 19.10.2026</w:t>
+            <w:t>Revizyon tarihi: 03.08.2026</w:t>
           </w:r>
         </w:p>
       </w:tc>

</xml_diff>